<commit_message>
AIIM: drop corresponding-author notice, institution addresses, and declarations
Per request, trim the manuscript front and back matter:
- remove the corresponding-author line and author emails (ORCIDs kept);
- keep only institution names in affiliations, drop postal addresses
  (street, city, postcode, country);
- drop the Author Contributions (CRediT), Data Availability, Funding, and
  Conflicts of Interest sections (and the cas-sc \credit / \cormark / \ead /
  \cortext front-matter that generated them).

Applied to index.html (source, also drives the Word front matter and back
matter) and both LaTeX build scripts. Rebuilt all three artifacts (elsarticle,
cas-sc, Word), refreshed the root-published deliverables and the badge targets,
and rebuilt AIIM_cas-sc_submission.zip. Verified the dropped content is absent
from the rendered PDFs; institution names, ORCIDs, and references remain.

Co-Authored-By: Claude Opus 4.8 <noreply@anthropic.com>
</commit_message>
<xml_diff>
--- a/submission-AIIM/Computable-Clinical-Intent_AIIM.docx
+++ b/submission-AIIM/Computable-Clinical-Intent_AIIM.docx
@@ -90,7 +90,7 @@
           <w:i/>
           <w:sz w:val="20"/>
         </w:rPr>
-        <w:t xml:space="preserve">School of Computer Science, Faculty of Sciences, Holon Institute of Technology (HIT), 52 Golomb St., Holon 5810201, Israel</w:t>
+        <w:t xml:space="preserve">School of Computer Science, Faculty of Sciences, Holon Institute of Technology (HIT)</w:t>
       </w:r>
     </w:p>
     <w:p>
@@ -119,7 +119,7 @@
           <w:i/>
           <w:sz w:val="20"/>
         </w:rPr>
-        <w:t xml:space="preserve">Intelligent Systems, Afeka Academic College of Engineering, 218 Bnei Efraim St., Tel-Aviv 6910717, Israel</w:t>
+        <w:t xml:space="preserve">Intelligent Systems, Afeka Academic College of Engineering</w:t>
       </w:r>
     </w:p>
     <w:p>
@@ -138,7 +138,7 @@
           <w:i/>
           <w:sz w:val="20"/>
         </w:rPr>
-        <w:t xml:space="preserve">Corresponding author: Yehudit Aperstein, apersteiny@afeka.ac.il. ORCID: Apartsin 0009-0000-7007-3529, Aperstein 0000-0001-6390-9463. Submitted to</w:t>
+        <w:t xml:space="preserve">ORCID: Apartsin 0009-0000-7007-3529, Aperstein 0000-0001-6390-9463. Submitted to</w:t>
       </w:r>
       <w:r>
         <w:rPr>
@@ -9031,107 +9031,7 @@
       </w:r>
     </w:p>
     <w:bookmarkEnd w:id="32"/>
-    <w:bookmarkStart w:id="33" w:name="data-availability"/>
-    <w:p>
-      <w:pPr>
-        <w:pStyle w:val="Heading2"/>
-        <w:keepNext/>
-        <w:keepLines/>
-        <w:widowControl w:val="1"/>
-      </w:pPr>
-      <w:r>
-        <w:t xml:space="preserve">Data Availability</w:t>
-      </w:r>
-    </w:p>
-    <w:p>
-      <w:pPr>
-        <w:pStyle w:val="FirstParagraph"/>
-        <w:jc w:val="both"/>
-        <w:keepNext w:val="0"/>
-        <w:keepLines w:val="0"/>
-        <w:widowControl w:val="1"/>
-      </w:pPr>
-      <w:r>
-        <w:t xml:space="preserve">No new data were generated for this article. The feasibility results in Section 7 come from two companion studies [70-71], which report their own data provenance (a synthetic outpatient corpus in one, existing corpora harmonized under their own terms in the other) and availability. The ACR schema (Section 5) and the evaluation framework (Section 7) are specified in the text as an implementable framework; deployment-specific parameters, including execution thresholds, the safety taxonomy, exclusion relations, and benchmark thresholds, are prespecified per task. No custom code was produced.</w:t>
-      </w:r>
-    </w:p>
-    <w:bookmarkEnd w:id="33"/>
-    <w:bookmarkStart w:id="34" w:name="author-contributions-credit"/>
-    <w:p>
-      <w:pPr>
-        <w:pStyle w:val="Heading2"/>
-        <w:keepNext/>
-        <w:keepLines/>
-        <w:widowControl w:val="1"/>
-      </w:pPr>
-      <w:r>
-        <w:t xml:space="preserve">Author Contributions (CRediT)</w:t>
-      </w:r>
-    </w:p>
-    <w:p>
-      <w:pPr>
-        <w:pStyle w:val="FirstParagraph"/>
-        <w:jc w:val="both"/>
-        <w:keepNext w:val="0"/>
-        <w:keepLines w:val="0"/>
-        <w:widowControl w:val="1"/>
-      </w:pPr>
-      <w:r>
-        <w:t xml:space="preserve">A. Apartsin: Conceptualization, Methodology, Writing – original draft. Y. Aperstein: Conceptualization, Supervision, Writing – review and editing.</w:t>
-      </w:r>
-    </w:p>
-    <w:bookmarkEnd w:id="34"/>
-    <w:bookmarkStart w:id="35" w:name="funding"/>
-    <w:p>
-      <w:pPr>
-        <w:pStyle w:val="Heading2"/>
-        <w:keepNext/>
-        <w:keepLines/>
-        <w:widowControl w:val="1"/>
-      </w:pPr>
-      <w:r>
-        <w:t xml:space="preserve">Funding</w:t>
-      </w:r>
-    </w:p>
-    <w:p>
-      <w:pPr>
-        <w:pStyle w:val="FirstParagraph"/>
-        <w:jc w:val="both"/>
-        <w:keepNext w:val="0"/>
-        <w:keepLines w:val="0"/>
-        <w:widowControl w:val="1"/>
-      </w:pPr>
-      <w:r>
-        <w:t xml:space="preserve">None declared.</w:t>
-      </w:r>
-    </w:p>
-    <w:bookmarkEnd w:id="35"/>
-    <w:bookmarkStart w:id="36" w:name="conflicts-of-interest"/>
-    <w:p>
-      <w:pPr>
-        <w:pStyle w:val="Heading2"/>
-        <w:keepNext/>
-        <w:keepLines/>
-        <w:widowControl w:val="1"/>
-      </w:pPr>
-      <w:r>
-        <w:t xml:space="preserve">Conflicts of Interest</w:t>
-      </w:r>
-    </w:p>
-    <w:p>
-      <w:pPr>
-        <w:pStyle w:val="FirstParagraph"/>
-        <w:jc w:val="both"/>
-        <w:keepNext w:val="0"/>
-        <w:keepLines w:val="0"/>
-        <w:widowControl w:val="1"/>
-      </w:pPr>
-      <w:r>
-        <w:t xml:space="preserve">None declared.</w:t>
-      </w:r>
-    </w:p>
-    <w:bookmarkEnd w:id="36"/>
-    <w:bookmarkStart w:id="43" w:name="references"/>
+    <w:bookmarkStart w:id="39" w:name="references"/>
     <w:p>
       <w:pPr>
         <w:pStyle w:val="ReferencesHeading"/>
@@ -9981,7 +9881,7 @@
       <w:r>
         <w:t xml:space="preserve"> </w:t>
       </w:r>
-      <w:hyperlink r:id="rId37">
+      <w:hyperlink r:id="rId33">
         <w:r>
           <w:rPr>
             <w:rStyle w:val="Hyperlink"/>
@@ -10220,7 +10120,7 @@
       <w:r>
         <w:t xml:space="preserve"> </w:t>
       </w:r>
-      <w:hyperlink r:id="rId38">
+      <w:hyperlink r:id="rId34">
         <w:r>
           <w:rPr>
             <w:rStyle w:val="Hyperlink"/>
@@ -11479,7 +11379,7 @@
       <w:r>
         <w:t xml:space="preserve"> </w:t>
       </w:r>
-      <w:hyperlink r:id="rId39">
+      <w:hyperlink r:id="rId35">
         <w:r>
           <w:rPr>
             <w:rStyle w:val="Hyperlink"/>
@@ -11527,7 +11427,7 @@
       <w:r>
         <w:t xml:space="preserve"> </w:t>
       </w:r>
-      <w:hyperlink r:id="rId40">
+      <w:hyperlink r:id="rId36">
         <w:r>
           <w:rPr>
             <w:rStyle w:val="Hyperlink"/>
@@ -11673,7 +11573,7 @@
       <w:r>
         <w:t xml:space="preserve"> </w:t>
       </w:r>
-      <w:hyperlink r:id="rId41">
+      <w:hyperlink r:id="rId37">
         <w:r>
           <w:rPr>
             <w:rStyle w:val="Hyperlink"/>
@@ -11727,7 +11627,7 @@
       <w:r>
         <w:t xml:space="preserve"> </w:t>
       </w:r>
-      <w:hyperlink r:id="rId42">
+      <w:hyperlink r:id="rId38">
         <w:r>
           <w:rPr>
             <w:rStyle w:val="Hyperlink"/>
@@ -11871,7 +11771,7 @@
         <w:t xml:space="preserve">2025;7:1659134. doi:10.3389/fdgth.2025.1659134.</w:t>
       </w:r>
     </w:p>
-    <w:bookmarkEnd w:id="43"/>
+    <w:bookmarkEnd w:id="39"/>
     <w:sectPr>
       <w:footerReference w:type="default" r:id="rId9"/>
       <w:pgSz w:h="15840" w:w="12240"/>

</xml_diff>

<commit_message>
AIIM: drop ORCID/venue line and PhD titles; resync HTML, PDF, TeX, DOCX
- Remove the ORCID + "Submitted to AIIM" venue line (index.html) and the ORCID
  fields from the cas-sc front matter.
- Drop "PhD" after the author names (index.html; the LaTeX builds already used
  bare names).
Rebuilt all four renderings and the self-contained root TeX source, refreshed
the root-published deliverables and the submission zip. Verified every format
(HTML / 2-col PDF / cas-sc PDF / TeX / DOCX) is in sync: no PhD, ORCID, email,
address, corresponding-author notice, or declaration sections; author names,
institution names, title, and 73 references intact.

Co-Authored-By: Claude Opus 4.8 <noreply@anthropic.com>
</commit_message>
<xml_diff>
--- a/submission-AIIM/Computable-Clinical-Intent_AIIM.docx
+++ b/submission-AIIM/Computable-Clinical-Intent_AIIM.docx
@@ -32,7 +32,7 @@
           <w:i/>
           <w:sz w:val="20"/>
         </w:rPr>
-        <w:t xml:space="preserve">Alexander Apartsin, PhD</w:t>
+        <w:t xml:space="preserve">Alexander Apartsin</w:t>
       </w:r>
       <w:r>
         <w:rPr>
@@ -51,7 +51,7 @@
           <w:i/>
           <w:sz w:val="20"/>
         </w:rPr>
-        <w:t xml:space="preserve">, Yehudit Aperstein, PhD</w:t>
+        <w:t xml:space="preserve">, Yehudit Aperstein</w:t>
       </w:r>
       <w:r>
         <w:rPr>
@@ -120,62 +120,6 @@
           <w:sz w:val="20"/>
         </w:rPr>
         <w:t xml:space="preserve">Intelligent Systems, Afeka Academic College of Engineering</w:t>
-      </w:r>
-    </w:p>
-    <w:p>
-      <w:pPr>
-        <w:pStyle w:val="Subtitle"/>
-        <w:spacing w:before="0" w:after="160"/>
-        <w:jc w:val="center"/>
-        <w:keepNext w:val="0"/>
-        <w:keepLines/>
-        <w:widowControl w:val="1"/>
-      </w:pPr>
-      <w:r>
-        <w:rPr>
-          <w:rFonts w:ascii="Times New Roman" w:hAnsi="Times New Roman"/>
-          <w:b w:val="0"/>
-          <w:i/>
-          <w:sz w:val="20"/>
-        </w:rPr>
-        <w:t xml:space="preserve">ORCID: Apartsin 0009-0000-7007-3529, Aperstein 0000-0001-6390-9463. Submitted to</w:t>
-      </w:r>
-      <w:r>
-        <w:rPr>
-          <w:rFonts w:ascii="Times New Roman" w:hAnsi="Times New Roman"/>
-          <w:b w:val="0"/>
-          <w:i/>
-          <w:sz w:val="20"/>
-        </w:rPr>
-        <w:t xml:space="preserve"> </w:t>
-      </w:r>
-      <w:r>
-        <w:rPr>
-          <w:rFonts w:ascii="Times New Roman" w:hAnsi="Times New Roman"/>
-          <w:b w:val="0"/>
-          <w:i/>
-          <w:iCs/>
-          <w:sz w:val="20"/>
-        </w:rPr>
-        <w:t xml:space="preserve">Artificial Intelligence in Medicine</w:t>
-      </w:r>
-      <w:r>
-        <w:rPr>
-          <w:rFonts w:ascii="Times New Roman" w:hAnsi="Times New Roman"/>
-          <w:b w:val="0"/>
-          <w:i/>
-          <w:sz w:val="20"/>
-        </w:rPr>
-        <w:t xml:space="preserve"> </w:t>
-      </w:r>
-      <w:r>
-        <w:rPr>
-          <w:rFonts w:ascii="Times New Roman" w:hAnsi="Times New Roman"/>
-          <w:b w:val="0"/>
-          <w:i/>
-          <w:sz w:val="20"/>
-        </w:rPr>
-        <w:t xml:space="preserve">as a Position Paper.</w:t>
       </w:r>
     </w:p>
     <w:bookmarkEnd w:id="9"/>

</xml_diff>